<commit_message>
v2.1.0  Reorganized repo, professional README with visualizations, research paper with figures
</commit_message>
<xml_diff>
--- a/docs/AGD_Official_Research_Paper.docx
+++ b/docs/AGD_Official_Research_Paper.docx
@@ -1435,56 +1435,6 @@
     </w:p>
     <w:p>
       <w:pPr>
-        <w:jc w:val="center"/>
-      </w:pPr>
-      <w:r>
-        <w:drawing>
-          <wp:inline xmlns:a="http://schemas.openxmlformats.org/drawingml/2006/main" xmlns:pic="http://schemas.openxmlformats.org/drawingml/2006/picture">
-            <wp:extent cx="4572000" cy="2743200"/>
-            <wp:docPr id="2" name="Picture 2"/>
-            <wp:cNvGraphicFramePr>
-              <a:graphicFrameLocks noChangeAspect="1"/>
-            </wp:cNvGraphicFramePr>
-            <a:graphic>
-              <a:graphicData uri="http://schemas.openxmlformats.org/drawingml/2006/picture">
-                <pic:pic>
-                  <pic:nvPicPr>
-                    <pic:cNvPr id="0" name="benchmark_plot_sota.png"/>
-                    <pic:cNvPicPr/>
-                  </pic:nvPicPr>
-                  <pic:blipFill>
-                    <a:blip r:embed="rId10"/>
-                    <a:stretch>
-                      <a:fillRect/>
-                    </a:stretch>
-                  </pic:blipFill>
-                  <pic:spPr>
-                    <a:xfrm>
-                      <a:off x="0" y="0"/>
-                      <a:ext cx="4572000" cy="2743200"/>
-                    </a:xfrm>
-                    <a:prstGeom prst="rect"/>
-                  </pic:spPr>
-                </pic:pic>
-              </a:graphicData>
-            </a:graphic>
-          </wp:inline>
-        </w:drawing>
-      </w:r>
-    </w:p>
-    <w:p>
-      <w:pPr>
-        <w:jc w:val="center"/>
-      </w:pPr>
-      <w:r>
-        <w:rPr>
-          <w:i/>
-        </w:rPr>
-        <w:t>Figure 1: AGD SOTA Performance vs. GPTZero, ZeroGPT, and CIFAKE-CNN Baselines</w:t>
-      </w:r>
-    </w:p>
-    <w:p>
-      <w:pPr>
         <w:pStyle w:val="Heading1"/>
       </w:pPr>
       <w:r>

</xml_diff>